<commit_message>
Final docs, progress log
Co-Authored-By: Claude Opus 5.5 <noreply@anthropic.com>
</commit_message>
<xml_diff>
--- a/deliverables/Tethered-Design-Document.docx
+++ b/deliverables/Tethered-Design-Document.docx
@@ -30,7 +30,7 @@
           <w:sz w:val="24"/>
           <w:szCs w:val="24"/>
         </w:rPr>
-        <w:t xml:space="preserve">Mechanics, waves, difficulty tuning and simulation results · v1.0.0</w:t>
+        <w:t xml:space="preserve">Mechanics, waves, difficulty tuning and simulation results · v1.1.0</w:t>
       </w:r>
     </w:p>
     <w:p>
@@ -1414,17 +1414,17 @@
         <w:spacing w:after="60" w:line="264"/>
       </w:pPr>
       <w:r>
-        <w:t xml:space="preserve">Stars: ★ clear · ★★ clear with ≥ 3 lives left · ★★★ clear with ≥ 5 lives left </w:t>
+        <w:t xml:space="preserve">Stars: ★ clear · ★★ clear taking ≤ 4 hits (team total) · ★★★ </w:t>
       </w:r>
       <w:r>
         <w:rPr>
           <w:b/>
           <w:bCs/>
         </w:rPr>
-        <w:t xml:space="preserve">and</w:t>
-      </w:r>
-      <w:r>
-        <w:t xml:space="preserve"> ≥ 23,200 points. Assist-mode bonus lives don’t count toward stars. Stars are a goal to chase, never a gate.</w:t>
+        <w:t xml:space="preserve">flawless</w:t>
+      </w:r>
+      <w:r>
+        <w:t xml:space="preserve"> clear (no hits) in under 7:05. Hit-based rules were chosen after review because they are readable for 10-year-olds and reward skill directly (a score threshold was opaque). The rules are shown on the Survival card and the end screen says how many hits you took. Stars are a goal to chase, never a gate.</w:t>
       </w:r>
     </w:p>
     <w:p>
@@ -2900,10 +2900,10 @@
           <w:b/>
           <w:bCs/>
         </w:rPr>
-        <w:t xml:space="preserve">Danger</w:t>
-      </w:r>
-      <w:r>
-        <w:t xml:space="preserve"> — a slow drifter approaches; touching it shows “Ouch! That costs a life” without costing one.</w:t>
+        <w:t xml:space="preserve">Power-up</w:t>
+      </w:r>
+      <w:r>
+        <w:t xml:space="preserve"> — a Link capsule appears: both orbs stand in its ring together to unlock it.</w:t>
       </w:r>
     </w:p>
     <w:p>
@@ -2920,10 +2920,30 @@
           <w:b/>
           <w:bCs/>
         </w:rPr>
+        <w:t xml:space="preserve">Danger</w:t>
+      </w:r>
+      <w:r>
+        <w:t xml:space="preserve"> — a slow drifter approaches; touching it shows “Ouch! In a real game that costs a life” without costing one.</w:t>
+      </w:r>
+    </w:p>
+    <w:p>
+      <w:pPr>
+        <w:pStyle w:val="ListParagraph"/>
+        <w:numPr>
+          <w:ilvl w:val="0"/>
+          <w:numId w:val="3"/>
+        </w:numPr>
+        <w:spacing w:after="60" w:line="264"/>
+      </w:pPr>
+      <w:r>
+        <w:rPr>
+          <w:b/>
+          <w:bCs/>
+        </w:rPr>
         <w:t xml:space="preserve">Mini-wave</w:t>
       </w:r>
       <w:r>
-        <w:t xml:space="preserve"> — five drifters; then “Ready!” and wave 1 begins.</w:t>
+        <w:t xml:space="preserve"> — five drifters; then “Ready!” and wave 1 begins (from “How to play”, a choice screen offers Play Survival or Main menu instead).</w:t>
       </w:r>
     </w:p>
     <w:p>
@@ -3020,7 +3040,7 @@
         <w:t xml:space="preserve">Host-authoritative:</w:t>
       </w:r>
       <w:r>
-        <w:t xml:space="preserve"> the guest sends stick input at 30 Hz; the host simulates both orbs and sends quantised snapshots at 20 Hz on a pre-negotiated </w:t>
+        <w:t xml:space="preserve"> the guest sends stick input at 30 Hz; the host simulates both orbs and sends quantised snapshots at 25 Hz on a pre-negotiated </w:t>
       </w:r>
       <w:r>
         <w:rPr>
@@ -3043,7 +3063,7 @@
         <w:spacing w:after="60" w:line="264"/>
       </w:pPr>
       <w:r>
-        <w:t xml:space="preserve">Guest renders 100 ms in the past with interpolation; its own orb is predicted locally and softly corrected, so steering feels immediate.</w:t>
+        <w:t xml:space="preserve">Guest renders 120 ms in the past with interpolation; its own orb is predicted locally and softly corrected, so steering feels immediate.</w:t>
       </w:r>
     </w:p>
     <w:p>
@@ -4074,7 +4094,7 @@
                 <w:sz w:val="19"/>
                 <w:szCs w:val="19"/>
               </w:rPr>
-              <w:t xml:space="preserve">70%</w:t>
+              <w:t xml:space="preserve">69%</w:t>
             </w:r>
           </w:p>
         </w:tc>
@@ -4166,7 +4186,7 @@
                 <w:sz w:val="19"/>
                 <w:szCs w:val="19"/>
               </w:rPr>
-              <w:t xml:space="preserve">2:23</w:t>
+              <w:t xml:space="preserve">2:19</w:t>
             </w:r>
           </w:p>
         </w:tc>
@@ -4260,7 +4280,7 @@
                 <w:sz w:val="19"/>
                 <w:szCs w:val="19"/>
               </w:rPr>
-              <w:t xml:space="preserve">40%</w:t>
+              <w:t xml:space="preserve">35%</w:t>
             </w:r>
           </w:p>
         </w:tc>
@@ -4283,7 +4303,7 @@
                 <w:sz w:val="19"/>
                 <w:szCs w:val="19"/>
               </w:rPr>
-              <w:t xml:space="preserve">31 / 45 / 3</w:t>
+              <w:t xml:space="preserve">62 / 8 / 0</w:t>
             </w:r>
           </w:p>
         </w:tc>
@@ -4423,7 +4443,7 @@
                 <w:sz w:val="19"/>
                 <w:szCs w:val="19"/>
               </w:rPr>
-              <w:t xml:space="preserve">95%</w:t>
+              <w:t xml:space="preserve">99%</w:t>
             </w:r>
           </w:p>
         </w:tc>
@@ -4446,7 +4466,7 @@
                 <w:sz w:val="19"/>
                 <w:szCs w:val="19"/>
               </w:rPr>
-              <w:t xml:space="preserve">2 / 177 / 11</w:t>
+              <w:t xml:space="preserve">8 / 174 / 15</w:t>
             </w:r>
           </w:p>
         </w:tc>
@@ -4492,7 +4512,7 @@
                 <w:sz w:val="19"/>
                 <w:szCs w:val="19"/>
               </w:rPr>
-              <w:t xml:space="preserve">7:15</w:t>
+              <w:t xml:space="preserve">7:18</w:t>
             </w:r>
           </w:p>
         </w:tc>
@@ -4916,7 +4936,7 @@
                 <w:sz w:val="19"/>
                 <w:szCs w:val="19"/>
               </w:rPr>
-              <w:t xml:space="preserve">5</w:t>
+              <w:t xml:space="preserve">10</w:t>
             </w:r>
           </w:p>
         </w:tc>
@@ -4939,7 +4959,7 @@
                 <w:sz w:val="19"/>
                 <w:szCs w:val="19"/>
               </w:rPr>
-              <w:t xml:space="preserve">56</w:t>
+              <w:t xml:space="preserve">52</w:t>
             </w:r>
           </w:p>
         </w:tc>
@@ -4962,7 +4982,7 @@
                 <w:sz w:val="19"/>
                 <w:szCs w:val="19"/>
               </w:rPr>
-              <w:t xml:space="preserve">72</w:t>
+              <w:t xml:space="preserve">64</w:t>
             </w:r>
           </w:p>
         </w:tc>
@@ -4985,7 +5005,7 @@
                 <w:sz w:val="19"/>
                 <w:szCs w:val="19"/>
               </w:rPr>
-              <w:t xml:space="preserve">45</w:t>
+              <w:t xml:space="preserve">57</w:t>
             </w:r>
           </w:p>
         </w:tc>
@@ -5008,7 +5028,7 @@
                 <w:sz w:val="19"/>
                 <w:szCs w:val="19"/>
               </w:rPr>
-              <w:t xml:space="preserve">18</w:t>
+              <w:t xml:space="preserve">16</w:t>
             </w:r>
           </w:p>
         </w:tc>
@@ -5031,7 +5051,7 @@
                 <w:sz w:val="19"/>
                 <w:szCs w:val="19"/>
               </w:rPr>
-              <w:t xml:space="preserve">4</w:t>
+              <w:t xml:space="preserve">1</w:t>
             </w:r>
           </w:p>
         </w:tc>
@@ -5217,6 +5237,29 @@
                 <w:sz w:val="19"/>
                 <w:szCs w:val="19"/>
               </w:rPr>
+              <w:t xml:space="preserve">0</w:t>
+            </w:r>
+          </w:p>
+        </w:tc>
+        <w:tc>
+          <w:tcPr>
+            <w:tcW w:type="dxa" w:w="803"/>
+            <w:tcMar>
+              <w:top w:type="dxa" w:w="60"/>
+              <w:left w:type="dxa" w:w="100"/>
+              <w:bottom w:type="dxa" w:w="60"/>
+              <w:right w:type="dxa" w:w="100"/>
+            </w:tcMar>
+          </w:tcPr>
+          <w:p>
+            <w:pPr>
+              <w:spacing w:after="0"/>
+            </w:pPr>
+            <w:r>
+              <w:rPr>
+                <w:sz w:val="19"/>
+                <w:szCs w:val="19"/>
+              </w:rPr>
               <w:t xml:space="preserve">1</w:t>
             </w:r>
           </w:p>
@@ -5240,6 +5283,29 @@
                 <w:sz w:val="19"/>
                 <w:szCs w:val="19"/>
               </w:rPr>
+              <w:t xml:space="preserve">3</w:t>
+            </w:r>
+          </w:p>
+        </w:tc>
+        <w:tc>
+          <w:tcPr>
+            <w:tcW w:type="dxa" w:w="803"/>
+            <w:tcMar>
+              <w:top w:type="dxa" w:w="60"/>
+              <w:left w:type="dxa" w:w="100"/>
+              <w:bottom w:type="dxa" w:w="60"/>
+              <w:right w:type="dxa" w:w="100"/>
+            </w:tcMar>
+          </w:tcPr>
+          <w:p>
+            <w:pPr>
+              <w:spacing w:after="0"/>
+            </w:pPr>
+            <w:r>
+              <w:rPr>
+                <w:sz w:val="19"/>
+                <w:szCs w:val="19"/>
+              </w:rPr>
               <w:t xml:space="preserve">1</w:t>
             </w:r>
           </w:p>
@@ -5286,53 +5352,7 @@
                 <w:sz w:val="19"/>
                 <w:szCs w:val="19"/>
               </w:rPr>
-              <w:t xml:space="preserve">2</w:t>
-            </w:r>
-          </w:p>
-        </w:tc>
-        <w:tc>
-          <w:tcPr>
-            <w:tcW w:type="dxa" w:w="803"/>
-            <w:tcMar>
-              <w:top w:type="dxa" w:w="60"/>
-              <w:left w:type="dxa" w:w="100"/>
-              <w:bottom w:type="dxa" w:w="60"/>
-              <w:right w:type="dxa" w:w="100"/>
-            </w:tcMar>
-          </w:tcPr>
-          <w:p>
-            <w:pPr>
-              <w:spacing w:after="0"/>
-            </w:pPr>
-            <w:r>
-              <w:rPr>
-                <w:sz w:val="19"/>
-                <w:szCs w:val="19"/>
-              </w:rPr>
-              <w:t xml:space="preserve">1</w:t>
-            </w:r>
-          </w:p>
-        </w:tc>
-        <w:tc>
-          <w:tcPr>
-            <w:tcW w:type="dxa" w:w="803"/>
-            <w:tcMar>
-              <w:top w:type="dxa" w:w="60"/>
-              <w:left w:type="dxa" w:w="100"/>
-              <w:bottom w:type="dxa" w:w="60"/>
-              <w:right w:type="dxa" w:w="100"/>
-            </w:tcMar>
-          </w:tcPr>
-          <w:p>
-            <w:pPr>
-              <w:spacing w:after="0"/>
-            </w:pPr>
-            <w:r>
-              <w:rPr>
-                <w:sz w:val="19"/>
-                <w:szCs w:val="19"/>
-              </w:rPr>
-              <w:t xml:space="preserve">27</w:t>
+              <w:t xml:space="preserve">33</w:t>
             </w:r>
           </w:p>
         </w:tc>
@@ -5355,7 +5375,7 @@
                 <w:sz w:val="19"/>
                 <w:szCs w:val="19"/>
               </w:rPr>
-              <w:t xml:space="preserve">85</w:t>
+              <w:t xml:space="preserve">88</w:t>
             </w:r>
           </w:p>
         </w:tc>
@@ -5518,7 +5538,7 @@
                 <w:sz w:val="19"/>
                 <w:szCs w:val="19"/>
               </w:rPr>
-              <w:t xml:space="preserve">4</w:t>
+              <w:t xml:space="preserve">3</w:t>
             </w:r>
           </w:p>
         </w:tc>
@@ -5541,7 +5561,7 @@
                 <w:sz w:val="19"/>
                 <w:szCs w:val="19"/>
               </w:rPr>
-              <w:t xml:space="preserve">2</w:t>
+              <w:t xml:space="preserve">0</w:t>
             </w:r>
           </w:p>
         </w:tc>
@@ -5564,7 +5584,7 @@
                 <w:sz w:val="19"/>
                 <w:szCs w:val="19"/>
               </w:rPr>
-              <w:t xml:space="preserve">1</w:t>
+              <w:t xml:space="preserve">0</w:t>
             </w:r>
           </w:p>
         </w:tc>
@@ -5587,7 +5607,7 @@
                 <w:sz w:val="19"/>
                 <w:szCs w:val="19"/>
               </w:rPr>
-              <w:t xml:space="preserve">3</w:t>
+              <w:t xml:space="preserve">0</w:t>
             </w:r>
           </w:p>
         </w:tc>
@@ -5876,7 +5896,7 @@
                 <w:sz w:val="19"/>
                 <w:szCs w:val="19"/>
               </w:rPr>
-              <w:t xml:space="preserve">98%</w:t>
+              <w:t xml:space="preserve">96%</w:t>
             </w:r>
           </w:p>
         </w:tc>
@@ -5899,7 +5919,7 @@
                 <w:sz w:val="19"/>
                 <w:szCs w:val="19"/>
               </w:rPr>
-              <w:t xml:space="preserve">2:14</w:t>
+              <w:t xml:space="preserve">2:04</w:t>
             </w:r>
           </w:p>
         </w:tc>
@@ -5922,7 +5942,7 @@
                 <w:sz w:val="19"/>
                 <w:szCs w:val="19"/>
               </w:rPr>
-              <w:t xml:space="preserve">1:24 – 3:11</w:t>
+              <w:t xml:space="preserve">1:16 – 3:06</w:t>
             </w:r>
           </w:p>
         </w:tc>
@@ -6062,7 +6082,7 @@
                 <w:sz w:val="19"/>
                 <w:szCs w:val="19"/>
               </w:rPr>
-              <w:t xml:space="preserve">5:32</w:t>
+              <w:t xml:space="preserve">5:28</w:t>
             </w:r>
           </w:p>
         </w:tc>
@@ -6085,7 +6105,7 @@
                 <w:sz w:val="19"/>
                 <w:szCs w:val="19"/>
               </w:rPr>
-              <w:t xml:space="preserve">4:26 – 7:02</w:t>
+              <w:t xml:space="preserve">4:12 – 6:55</w:t>
             </w:r>
           </w:p>
         </w:tc>
@@ -6225,7 +6245,7 @@
                 <w:sz w:val="19"/>
                 <w:szCs w:val="19"/>
               </w:rPr>
-              <w:t xml:space="preserve">10:21</w:t>
+              <w:t xml:space="preserve">10:22</w:t>
             </w:r>
           </w:p>
         </w:tc>
@@ -6248,7 +6268,7 @@
                 <w:sz w:val="19"/>
                 <w:szCs w:val="19"/>
               </w:rPr>
-              <w:t xml:space="preserve">8:30 – 11:42</w:t>
+              <w:t xml:space="preserve">8:40 – 11:35</w:t>
             </w:r>
           </w:p>
         </w:tc>
@@ -6329,7 +6349,1842 @@
         <w:spacing w:after="120" w:before="240"/>
       </w:pPr>
       <w:r>
-        <w:t xml:space="preserve">12. Architecture and extension points</w:t>
+        <w:t xml:space="preserve">12. Independent review — issues found and fixed</w:t>
+      </w:r>
+    </w:p>
+    <w:p>
+      <w:pPr>
+        <w:spacing w:after="120" w:line="276"/>
+      </w:pPr>
+      <w:r>
+        <w:t xml:space="preserve">A separate reviewer agent (no prior knowledge of the project) played the game with Playwright on mobile viewports with touch, both modes, the tutorial, and a two-browser-context PeerJS session with simulated disconnects. It reported 24 issues; all were addressed:</w:t>
+      </w:r>
+    </w:p>
+    <w:tbl>
+      <w:tblPr>
+        <w:tblW w:type="dxa" w:w="9638"/>
+        <w:tblBorders>
+          <w:top w:val="single" w:color="auto" w:sz="4"/>
+          <w:left w:val="single" w:color="auto" w:sz="4"/>
+          <w:bottom w:val="single" w:color="auto" w:sz="4"/>
+          <w:right w:val="single" w:color="auto" w:sz="4"/>
+          <w:insideH w:val="single" w:color="auto" w:sz="4"/>
+          <w:insideV w:val="single" w:color="auto" w:sz="4"/>
+        </w:tblBorders>
+      </w:tblPr>
+      <w:tblGrid>
+        <w:gridCol w:w="1157"/>
+        <w:gridCol w:w="4241"/>
+        <w:gridCol w:w="4240"/>
+      </w:tblGrid>
+      <w:tr>
+        <w:trPr>
+          <w:tblHeader/>
+        </w:trPr>
+        <w:tc>
+          <w:tcPr>
+            <w:tcW w:type="dxa" w:w="1157"/>
+            <w:shd w:fill="DCE6F1" w:color="auto" w:val="clear"/>
+            <w:tcMar>
+              <w:top w:type="dxa" w:w="60"/>
+              <w:left w:type="dxa" w:w="100"/>
+              <w:bottom w:type="dxa" w:w="60"/>
+              <w:right w:type="dxa" w:w="100"/>
+            </w:tcMar>
+          </w:tcPr>
+          <w:p>
+            <w:pPr>
+              <w:spacing w:after="0"/>
+            </w:pPr>
+            <w:r>
+              <w:rPr>
+                <w:b/>
+                <w:bCs/>
+                <w:sz w:val="19"/>
+                <w:szCs w:val="19"/>
+              </w:rPr>
+              <w:t xml:space="preserve">Severity</w:t>
+            </w:r>
+          </w:p>
+        </w:tc>
+        <w:tc>
+          <w:tcPr>
+            <w:tcW w:type="dxa" w:w="4241"/>
+            <w:shd w:fill="DCE6F1" w:color="auto" w:val="clear"/>
+            <w:tcMar>
+              <w:top w:type="dxa" w:w="60"/>
+              <w:left w:type="dxa" w:w="100"/>
+              <w:bottom w:type="dxa" w:w="60"/>
+              <w:right w:type="dxa" w:w="100"/>
+            </w:tcMar>
+          </w:tcPr>
+          <w:p>
+            <w:pPr>
+              <w:spacing w:after="0"/>
+            </w:pPr>
+            <w:r>
+              <w:rPr>
+                <w:b/>
+                <w:bCs/>
+                <w:sz w:val="19"/>
+                <w:szCs w:val="19"/>
+              </w:rPr>
+              <w:t xml:space="preserve">Issue</w:t>
+            </w:r>
+          </w:p>
+        </w:tc>
+        <w:tc>
+          <w:tcPr>
+            <w:tcW w:type="dxa" w:w="4240"/>
+            <w:shd w:fill="DCE6F1" w:color="auto" w:val="clear"/>
+            <w:tcMar>
+              <w:top w:type="dxa" w:w="60"/>
+              <w:left w:type="dxa" w:w="100"/>
+              <w:bottom w:type="dxa" w:w="60"/>
+              <w:right w:type="dxa" w:w="100"/>
+            </w:tcMar>
+          </w:tcPr>
+          <w:p>
+            <w:pPr>
+              <w:spacing w:after="0"/>
+            </w:pPr>
+            <w:r>
+              <w:rPr>
+                <w:b/>
+                <w:bCs/>
+                <w:sz w:val="19"/>
+                <w:szCs w:val="19"/>
+              </w:rPr>
+              <w:t xml:space="preserve">Fix</w:t>
+            </w:r>
+          </w:p>
+        </w:tc>
+      </w:tr>
+      <w:tr>
+        <w:tc>
+          <w:tcPr>
+            <w:tcW w:type="dxa" w:w="1157"/>
+            <w:tcMar>
+              <w:top w:type="dxa" w:w="60"/>
+              <w:left w:type="dxa" w:w="100"/>
+              <w:bottom w:type="dxa" w:w="60"/>
+              <w:right w:type="dxa" w:w="100"/>
+            </w:tcMar>
+          </w:tcPr>
+          <w:p>
+            <w:pPr>
+              <w:spacing w:after="0"/>
+            </w:pPr>
+            <w:r>
+              <w:rPr>
+                <w:sz w:val="19"/>
+                <w:szCs w:val="19"/>
+              </w:rPr>
+              <w:t xml:space="preserve">Major</w:t>
+            </w:r>
+          </w:p>
+        </w:tc>
+        <w:tc>
+          <w:tcPr>
+            <w:tcW w:type="dxa" w:w="4241"/>
+            <w:tcMar>
+              <w:top w:type="dxa" w:w="60"/>
+              <w:left w:type="dxa" w:w="100"/>
+              <w:bottom w:type="dxa" w:w="60"/>
+              <w:right w:type="dxa" w:w="100"/>
+            </w:tcMar>
+          </w:tcPr>
+          <w:p>
+            <w:pPr>
+              <w:spacing w:after="0"/>
+            </w:pPr>
+            <w:r>
+              <w:rPr>
+                <w:sz w:val="19"/>
+                <w:szCs w:val="19"/>
+              </w:rPr>
+              <w:t xml:space="preserve">Game loop crashed every frame when no AudioContext existed (demo, guest joining by link without tapping): canvas froze, end screen not sent to the guest.</w:t>
+            </w:r>
+          </w:p>
+        </w:tc>
+        <w:tc>
+          <w:tcPr>
+            <w:tcW w:type="dxa" w:w="4240"/>
+            <w:tcMar>
+              <w:top w:type="dxa" w:w="60"/>
+              <w:left w:type="dxa" w:w="100"/>
+              <w:bottom w:type="dxa" w:w="60"/>
+              <w:right w:type="dxa" w:w="100"/>
+            </w:tcMar>
+          </w:tcPr>
+          <w:p>
+            <w:pPr>
+              <w:spacing w:after="0"/>
+            </w:pPr>
+            <w:r>
+              <w:rPr>
+                <w:sz w:val="19"/>
+                <w:szCs w:val="19"/>
+              </w:rPr>
+              <w:t xml:space="preserve">All synth paths guard a missing AudioContext; every effect handler is wrapped so a cosmetic failure can never stop the simulation or rendering. Regression test added.</w:t>
+            </w:r>
+          </w:p>
+        </w:tc>
+      </w:tr>
+      <w:tr>
+        <w:tc>
+          <w:tcPr>
+            <w:tcW w:type="dxa" w:w="1157"/>
+            <w:tcMar>
+              <w:top w:type="dxa" w:w="60"/>
+              <w:left w:type="dxa" w:w="100"/>
+              <w:bottom w:type="dxa" w:w="60"/>
+              <w:right w:type="dxa" w:w="100"/>
+            </w:tcMar>
+          </w:tcPr>
+          <w:p>
+            <w:pPr>
+              <w:spacing w:after="0"/>
+            </w:pPr>
+            <w:r>
+              <w:rPr>
+                <w:sz w:val="19"/>
+                <w:szCs w:val="19"/>
+              </w:rPr>
+              <w:t xml:space="preserve">Major</w:t>
+            </w:r>
+          </w:p>
+        </w:tc>
+        <w:tc>
+          <w:tcPr>
+            <w:tcW w:type="dxa" w:w="4241"/>
+            <w:tcMar>
+              <w:top w:type="dxa" w:w="60"/>
+              <w:left w:type="dxa" w:w="100"/>
+              <w:bottom w:type="dxa" w:w="60"/>
+              <w:right w:type="dxa" w:w="100"/>
+            </w:tcMar>
+          </w:tcPr>
+          <w:p>
+            <w:pPr>
+              <w:spacing w:after="0"/>
+            </w:pPr>
+            <w:r>
+              <w:rPr>
+                <w:sz w:val="19"/>
+                <w:szCs w:val="19"/>
+              </w:rPr>
+              <w:t xml:space="preserve">If the host reloaded/closed, the guest waited on 'Reconnecting…' for a room that no longer existed.</w:t>
+            </w:r>
+          </w:p>
+        </w:tc>
+        <w:tc>
+          <w:tcPr>
+            <w:tcW w:type="dxa" w:w="4240"/>
+            <w:tcMar>
+              <w:top w:type="dxa" w:w="60"/>
+              <w:left w:type="dxa" w:w="100"/>
+              <w:bottom w:type="dxa" w:w="60"/>
+              <w:right w:type="dxa" w:w="100"/>
+            </w:tcMar>
+          </w:tcPr>
+          <w:p>
+            <w:pPr>
+              <w:spacing w:after="0"/>
+            </w:pPr>
+            <w:r>
+              <w:rPr>
+                <w:sz w:val="19"/>
+                <w:szCs w:val="19"/>
+              </w:rPr>
+              <w:t xml:space="preserve">Both pages send a goodbye on page unload; the guest also treats repeated 'peer unavailable' from the broker as 'The host left the game' with a Main menu button. Tested with local and real PeerJS (incl. a silent host crash).</w:t>
+            </w:r>
+          </w:p>
+        </w:tc>
+      </w:tr>
+      <w:tr>
+        <w:tc>
+          <w:tcPr>
+            <w:tcW w:type="dxa" w:w="1157"/>
+            <w:tcMar>
+              <w:top w:type="dxa" w:w="60"/>
+              <w:left w:type="dxa" w:w="100"/>
+              <w:bottom w:type="dxa" w:w="60"/>
+              <w:right w:type="dxa" w:w="100"/>
+            </w:tcMar>
+          </w:tcPr>
+          <w:p>
+            <w:pPr>
+              <w:spacing w:after="0"/>
+            </w:pPr>
+            <w:r>
+              <w:rPr>
+                <w:sz w:val="19"/>
+                <w:szCs w:val="19"/>
+              </w:rPr>
+              <w:t xml:space="preserve">Major</w:t>
+            </w:r>
+          </w:p>
+        </w:tc>
+        <w:tc>
+          <w:tcPr>
+            <w:tcW w:type="dxa" w:w="4241"/>
+            <w:tcMar>
+              <w:top w:type="dxa" w:w="60"/>
+              <w:left w:type="dxa" w:w="100"/>
+              <w:bottom w:type="dxa" w:w="60"/>
+              <w:right w:type="dxa" w:w="100"/>
+            </w:tcMar>
+          </w:tcPr>
+          <w:p>
+            <w:pPr>
+              <w:spacing w:after="0"/>
+            </w:pPr>
+            <w:r>
+              <w:rPr>
+                <w:sz w:val="19"/>
+                <w:szCs w:val="19"/>
+              </w:rPr>
+              <w:t xml:space="preserve">3 stars nearly unreachable and dependent on an opaque score bar.</w:t>
+            </w:r>
+          </w:p>
+        </w:tc>
+        <w:tc>
+          <w:tcPr>
+            <w:tcW w:type="dxa" w:w="4240"/>
+            <w:tcMar>
+              <w:top w:type="dxa" w:w="60"/>
+              <w:left w:type="dxa" w:w="100"/>
+              <w:bottom w:type="dxa" w:w="60"/>
+              <w:right w:type="dxa" w:w="100"/>
+            </w:tcMar>
+          </w:tcPr>
+          <w:p>
+            <w:pPr>
+              <w:spacing w:after="0"/>
+            </w:pPr>
+            <w:r>
+              <w:rPr>
+                <w:sz w:val="19"/>
+                <w:szCs w:val="19"/>
+              </w:rPr>
+              <w:t xml:space="preserve">Stars are now kid-readable and skill-based: 2★ = clear taking 4 hits or fewer, 3★ = flawless clear (no hits) under 7:05. Rules shown on the Survival card and on the end screen ('You took N hits…'). Strong pairs get 3★ in ~7% of runs.</w:t>
+            </w:r>
+          </w:p>
+        </w:tc>
+      </w:tr>
+      <w:tr>
+        <w:tc>
+          <w:tcPr>
+            <w:tcW w:type="dxa" w:w="1157"/>
+            <w:tcMar>
+              <w:top w:type="dxa" w:w="60"/>
+              <w:left w:type="dxa" w:w="100"/>
+              <w:bottom w:type="dxa" w:w="60"/>
+              <w:right w:type="dxa" w:w="100"/>
+            </w:tcMar>
+          </w:tcPr>
+          <w:p>
+            <w:pPr>
+              <w:spacing w:after="0"/>
+            </w:pPr>
+            <w:r>
+              <w:rPr>
+                <w:sz w:val="19"/>
+                <w:szCs w:val="19"/>
+              </w:rPr>
+              <w:t xml:space="preserve">Major</w:t>
+            </w:r>
+          </w:p>
+        </w:tc>
+        <w:tc>
+          <w:tcPr>
+            <w:tcW w:type="dxa" w:w="4241"/>
+            <w:tcMar>
+              <w:top w:type="dxa" w:w="60"/>
+              <w:left w:type="dxa" w:w="100"/>
+              <w:bottom w:type="dxa" w:w="60"/>
+              <w:right w:type="dxa" w:w="100"/>
+            </w:tcMar>
+          </w:tcPr>
+          <w:p>
+            <w:pPr>
+              <w:spacing w:after="0"/>
+            </w:pPr>
+            <w:r>
+              <w:rPr>
+                <w:sz w:val="19"/>
+                <w:szCs w:val="19"/>
+              </w:rPr>
+              <w:t xml:space="preserve">Endless difficulty spiked right after the first boss.</w:t>
+            </w:r>
+          </w:p>
+        </w:tc>
+        <w:tc>
+          <w:tcPr>
+            <w:tcW w:type="dxa" w:w="4240"/>
+            <w:tcMar>
+              <w:top w:type="dxa" w:w="60"/>
+              <w:left w:type="dxa" w:w="100"/>
+              <w:bottom w:type="dxa" w:w="60"/>
+              <w:right w:type="dxa" w:w="100"/>
+            </w:tcMar>
+          </w:tcPr>
+          <w:p>
+            <w:pPr>
+              <w:spacing w:after="0"/>
+            </w:pPr>
+            <w:r>
+              <w:rPr>
+                <w:sz w:val="19"/>
+                <w:szCs w:val="19"/>
+              </w:rPr>
+              <w:t xml:space="preserve">The wave after every boss is a breather (55% budget).</w:t>
+            </w:r>
+          </w:p>
+        </w:tc>
+      </w:tr>
+      <w:tr>
+        <w:tc>
+          <w:tcPr>
+            <w:tcW w:type="dxa" w:w="1157"/>
+            <w:tcMar>
+              <w:top w:type="dxa" w:w="60"/>
+              <w:left w:type="dxa" w:w="100"/>
+              <w:bottom w:type="dxa" w:w="60"/>
+              <w:right w:type="dxa" w:w="100"/>
+            </w:tcMar>
+          </w:tcPr>
+          <w:p>
+            <w:pPr>
+              <w:spacing w:after="0"/>
+            </w:pPr>
+            <w:r>
+              <w:rPr>
+                <w:sz w:val="19"/>
+                <w:szCs w:val="19"/>
+              </w:rPr>
+              <w:t xml:space="preserve">Major</w:t>
+            </w:r>
+          </w:p>
+        </w:tc>
+        <w:tc>
+          <w:tcPr>
+            <w:tcW w:type="dxa" w:w="4241"/>
+            <w:tcMar>
+              <w:top w:type="dxa" w:w="60"/>
+              <w:left w:type="dxa" w:w="100"/>
+              <w:bottom w:type="dxa" w:w="60"/>
+              <w:right w:type="dxa" w:w="100"/>
+            </w:tcMar>
+          </w:tcPr>
+          <w:p>
+            <w:pPr>
+              <w:spacing w:after="0"/>
+            </w:pPr>
+            <w:r>
+              <w:rPr>
+                <w:sz w:val="19"/>
+                <w:szCs w:val="19"/>
+              </w:rPr>
+              <w:t xml:space="preserve">'Skip tutorial' sat in Player 2's thumb zone.</w:t>
+            </w:r>
+          </w:p>
+        </w:tc>
+        <w:tc>
+          <w:tcPr>
+            <w:tcW w:type="dxa" w:w="4240"/>
+            <w:tcMar>
+              <w:top w:type="dxa" w:w="60"/>
+              <w:left w:type="dxa" w:w="100"/>
+              <w:bottom w:type="dxa" w:w="60"/>
+              <w:right w:type="dxa" w:w="100"/>
+            </w:tcMar>
+          </w:tcPr>
+          <w:p>
+            <w:pPr>
+              <w:spacing w:after="0"/>
+            </w:pPr>
+            <w:r>
+              <w:rPr>
+                <w:sz w:val="19"/>
+                <w:szCs w:val="19"/>
+              </w:rPr>
+              <w:t xml:space="preserve">Moved to the top bar beside Pause; 48 px tall buttons.</w:t>
+            </w:r>
+          </w:p>
+        </w:tc>
+      </w:tr>
+      <w:tr>
+        <w:tc>
+          <w:tcPr>
+            <w:tcW w:type="dxa" w:w="1157"/>
+            <w:tcMar>
+              <w:top w:type="dxa" w:w="60"/>
+              <w:left w:type="dxa" w:w="100"/>
+              <w:bottom w:type="dxa" w:w="60"/>
+              <w:right w:type="dxa" w:w="100"/>
+            </w:tcMar>
+          </w:tcPr>
+          <w:p>
+            <w:pPr>
+              <w:spacing w:after="0"/>
+            </w:pPr>
+            <w:r>
+              <w:rPr>
+                <w:sz w:val="19"/>
+                <w:szCs w:val="19"/>
+              </w:rPr>
+              <w:t xml:space="preserve">Minor</w:t>
+            </w:r>
+          </w:p>
+        </w:tc>
+        <w:tc>
+          <w:tcPr>
+            <w:tcW w:type="dxa" w:w="4241"/>
+            <w:tcMar>
+              <w:top w:type="dxa" w:w="60"/>
+              <w:left w:type="dxa" w:w="100"/>
+              <w:bottom w:type="dxa" w:w="60"/>
+              <w:right w:type="dxa" w:w="100"/>
+            </w:tcMar>
+          </w:tcPr>
+          <w:p>
+            <w:pPr>
+              <w:spacing w:after="0"/>
+            </w:pPr>
+            <w:r>
+              <w:rPr>
+                <w:sz w:val="19"/>
+                <w:szCs w:val="19"/>
+              </w:rPr>
+              <w:t xml:space="preserve">Tutorial said 'That costs a life' but didn't; lives hidden in tutorial.</w:t>
+            </w:r>
+          </w:p>
+        </w:tc>
+        <w:tc>
+          <w:tcPr>
+            <w:tcW w:type="dxa" w:w="4240"/>
+            <w:tcMar>
+              <w:top w:type="dxa" w:w="60"/>
+              <w:left w:type="dxa" w:w="100"/>
+              <w:bottom w:type="dxa" w:w="60"/>
+              <w:right w:type="dxa" w:w="100"/>
+            </w:tcMar>
+          </w:tcPr>
+          <w:p>
+            <w:pPr>
+              <w:spacing w:after="0"/>
+            </w:pPr>
+            <w:r>
+              <w:rPr>
+                <w:sz w:val="19"/>
+                <w:szCs w:val="19"/>
+              </w:rPr>
+              <w:t xml:space="preserve">Text now 'In a real game that costs a life'; hearts shown during the tutorial.</w:t>
+            </w:r>
+          </w:p>
+        </w:tc>
+      </w:tr>
+      <w:tr>
+        <w:tc>
+          <w:tcPr>
+            <w:tcW w:type="dxa" w:w="1157"/>
+            <w:tcMar>
+              <w:top w:type="dxa" w:w="60"/>
+              <w:left w:type="dxa" w:w="100"/>
+              <w:bottom w:type="dxa" w:w="60"/>
+              <w:right w:type="dxa" w:w="100"/>
+            </w:tcMar>
+          </w:tcPr>
+          <w:p>
+            <w:pPr>
+              <w:spacing w:after="0"/>
+            </w:pPr>
+            <w:r>
+              <w:rPr>
+                <w:sz w:val="19"/>
+                <w:szCs w:val="19"/>
+              </w:rPr>
+              <w:t xml:space="preserve">Minor</w:t>
+            </w:r>
+          </w:p>
+        </w:tc>
+        <w:tc>
+          <w:tcPr>
+            <w:tcW w:type="dxa" w:w="4241"/>
+            <w:tcMar>
+              <w:top w:type="dxa" w:w="60"/>
+              <w:left w:type="dxa" w:w="100"/>
+              <w:bottom w:type="dxa" w:w="60"/>
+              <w:right w:type="dxa" w:w="100"/>
+            </w:tcMar>
+          </w:tcPr>
+          <w:p>
+            <w:pPr>
+              <w:spacing w:after="0"/>
+            </w:pPr>
+            <w:r>
+              <w:rPr>
+                <w:sz w:val="19"/>
+                <w:szCs w:val="19"/>
+              </w:rPr>
+              <w:t xml:space="preserve">Tutorial never taught Link capsules; active power-up chip had no name.</w:t>
+            </w:r>
+          </w:p>
+        </w:tc>
+        <w:tc>
+          <w:tcPr>
+            <w:tcW w:type="dxa" w:w="4240"/>
+            <w:tcMar>
+              <w:top w:type="dxa" w:w="60"/>
+              <w:left w:type="dxa" w:w="100"/>
+              <w:bottom w:type="dxa" w:w="60"/>
+              <w:right w:type="dxa" w:w="100"/>
+            </w:tcMar>
+          </w:tcPr>
+          <w:p>
+            <w:pPr>
+              <w:spacing w:after="0"/>
+            </w:pPr>
+            <w:r>
+              <w:rPr>
+                <w:sz w:val="19"/>
+                <w:szCs w:val="19"/>
+              </w:rPr>
+              <w:t xml:space="preserve">New tutorial step: both orbs stand in a capsule ring. HUD chips show the power name and seconds left.</w:t>
+            </w:r>
+          </w:p>
+        </w:tc>
+      </w:tr>
+      <w:tr>
+        <w:tc>
+          <w:tcPr>
+            <w:tcW w:type="dxa" w:w="1157"/>
+            <w:tcMar>
+              <w:top w:type="dxa" w:w="60"/>
+              <w:left w:type="dxa" w:w="100"/>
+              <w:bottom w:type="dxa" w:w="60"/>
+              <w:right w:type="dxa" w:w="100"/>
+            </w:tcMar>
+          </w:tcPr>
+          <w:p>
+            <w:pPr>
+              <w:spacing w:after="0"/>
+            </w:pPr>
+            <w:r>
+              <w:rPr>
+                <w:sz w:val="19"/>
+                <w:szCs w:val="19"/>
+              </w:rPr>
+              <w:t xml:space="preserve">Minor</w:t>
+            </w:r>
+          </w:p>
+        </w:tc>
+        <w:tc>
+          <w:tcPr>
+            <w:tcW w:type="dxa" w:w="4241"/>
+            <w:tcMar>
+              <w:top w:type="dxa" w:w="60"/>
+              <w:left w:type="dxa" w:w="100"/>
+              <w:bottom w:type="dxa" w:w="60"/>
+              <w:right w:type="dxa" w:w="100"/>
+            </w:tcMar>
+          </w:tcPr>
+          <w:p>
+            <w:pPr>
+              <w:spacing w:after="0"/>
+            </w:pPr>
+            <w:r>
+              <w:rPr>
+                <w:sz w:val="19"/>
+                <w:szCs w:val="19"/>
+              </w:rPr>
+              <w:t xml:space="preserve">Spitter (diamond) resembled Player 2's diamond.</w:t>
+            </w:r>
+          </w:p>
+        </w:tc>
+        <w:tc>
+          <w:tcPr>
+            <w:tcW w:type="dxa" w:w="4240"/>
+            <w:tcMar>
+              <w:top w:type="dxa" w:w="60"/>
+              <w:left w:type="dxa" w:w="100"/>
+              <w:bottom w:type="dxa" w:w="60"/>
+              <w:right w:type="dxa" w:w="100"/>
+            </w:tcMar>
+          </w:tcPr>
+          <w:p>
+            <w:pPr>
+              <w:spacing w:after="0"/>
+            </w:pPr>
+            <w:r>
+              <w:rPr>
+                <w:sz w:val="19"/>
+                <w:szCs w:val="19"/>
+              </w:rPr>
+              <w:t xml:space="preserve">Spitter redrawn as a round turret with feet, a barrel and an eye.</w:t>
+            </w:r>
+          </w:p>
+        </w:tc>
+      </w:tr>
+      <w:tr>
+        <w:tc>
+          <w:tcPr>
+            <w:tcW w:type="dxa" w:w="1157"/>
+            <w:tcMar>
+              <w:top w:type="dxa" w:w="60"/>
+              <w:left w:type="dxa" w:w="100"/>
+              <w:bottom w:type="dxa" w:w="60"/>
+              <w:right w:type="dxa" w:w="100"/>
+            </w:tcMar>
+          </w:tcPr>
+          <w:p>
+            <w:pPr>
+              <w:spacing w:after="0"/>
+            </w:pPr>
+            <w:r>
+              <w:rPr>
+                <w:sz w:val="19"/>
+                <w:szCs w:val="19"/>
+              </w:rPr>
+              <w:t xml:space="preserve">Minor</w:t>
+            </w:r>
+          </w:p>
+        </w:tc>
+        <w:tc>
+          <w:tcPr>
+            <w:tcW w:type="dxa" w:w="4241"/>
+            <w:tcMar>
+              <w:top w:type="dxa" w:w="60"/>
+              <w:left w:type="dxa" w:w="100"/>
+              <w:bottom w:type="dxa" w:w="60"/>
+              <w:right w:type="dxa" w:w="100"/>
+            </w:tcMar>
+          </w:tcPr>
+          <w:p>
+            <w:pPr>
+              <w:spacing w:after="0"/>
+            </w:pPr>
+            <w:r>
+              <w:rPr>
+                <w:sz w:val="19"/>
+                <w:szCs w:val="19"/>
+              </w:rPr>
+              <w:t xml:space="preserve">Enemy shots hard to see among pink enemies.</w:t>
+            </w:r>
+          </w:p>
+        </w:tc>
+        <w:tc>
+          <w:tcPr>
+            <w:tcW w:type="dxa" w:w="4240"/>
+            <w:tcMar>
+              <w:top w:type="dxa" w:w="60"/>
+              <w:left w:type="dxa" w:w="100"/>
+              <w:bottom w:type="dxa" w:w="60"/>
+              <w:right w:type="dxa" w:w="100"/>
+            </w:tcMar>
+          </w:tcPr>
+          <w:p>
+            <w:pPr>
+              <w:spacing w:after="0"/>
+            </w:pPr>
+            <w:r>
+              <w:rPr>
+                <w:sz w:val="19"/>
+                <w:szCs w:val="19"/>
+              </w:rPr>
+              <w:t xml:space="preserve">Shots now have a white-hot core, dark ring, bright rim and a trail.</w:t>
+            </w:r>
+          </w:p>
+        </w:tc>
+      </w:tr>
+      <w:tr>
+        <w:tc>
+          <w:tcPr>
+            <w:tcW w:type="dxa" w:w="1157"/>
+            <w:tcMar>
+              <w:top w:type="dxa" w:w="60"/>
+              <w:left w:type="dxa" w:w="100"/>
+              <w:bottom w:type="dxa" w:w="60"/>
+              <w:right w:type="dxa" w:w="100"/>
+            </w:tcMar>
+          </w:tcPr>
+          <w:p>
+            <w:pPr>
+              <w:spacing w:after="0"/>
+            </w:pPr>
+            <w:r>
+              <w:rPr>
+                <w:sz w:val="19"/>
+                <w:szCs w:val="19"/>
+              </w:rPr>
+              <w:t xml:space="preserve">Minor</w:t>
+            </w:r>
+          </w:p>
+        </w:tc>
+        <w:tc>
+          <w:tcPr>
+            <w:tcW w:type="dxa" w:w="4241"/>
+            <w:tcMar>
+              <w:top w:type="dxa" w:w="60"/>
+              <w:left w:type="dxa" w:w="100"/>
+              <w:bottom w:type="dxa" w:w="60"/>
+              <w:right w:type="dxa" w:w="100"/>
+            </w:tcMar>
+          </w:tcPr>
+          <w:p>
+            <w:pPr>
+              <w:spacing w:after="0"/>
+            </w:pPr>
+            <w:r>
+              <w:rPr>
+                <w:sz w:val="19"/>
+                <w:szCs w:val="19"/>
+              </w:rPr>
+              <w:t xml:space="preserve">Spikes under text outlines (miter joins).</w:t>
+            </w:r>
+          </w:p>
+        </w:tc>
+        <w:tc>
+          <w:tcPr>
+            <w:tcW w:type="dxa" w:w="4240"/>
+            <w:tcMar>
+              <w:top w:type="dxa" w:w="60"/>
+              <w:left w:type="dxa" w:w="100"/>
+              <w:bottom w:type="dxa" w:w="60"/>
+              <w:right w:type="dxa" w:w="100"/>
+            </w:tcMar>
+          </w:tcPr>
+          <w:p>
+            <w:pPr>
+              <w:spacing w:after="0"/>
+            </w:pPr>
+            <w:r>
+              <w:rPr>
+                <w:sz w:val="19"/>
+                <w:szCs w:val="19"/>
+              </w:rPr>
+              <w:t xml:space="preserve">Round line joins for all outlined text.</w:t>
+            </w:r>
+          </w:p>
+        </w:tc>
+      </w:tr>
+      <w:tr>
+        <w:tc>
+          <w:tcPr>
+            <w:tcW w:type="dxa" w:w="1157"/>
+            <w:tcMar>
+              <w:top w:type="dxa" w:w="60"/>
+              <w:left w:type="dxa" w:w="100"/>
+              <w:bottom w:type="dxa" w:w="60"/>
+              <w:right w:type="dxa" w:w="100"/>
+            </w:tcMar>
+          </w:tcPr>
+          <w:p>
+            <w:pPr>
+              <w:spacing w:after="0"/>
+            </w:pPr>
+            <w:r>
+              <w:rPr>
+                <w:sz w:val="19"/>
+                <w:szCs w:val="19"/>
+              </w:rPr>
+              <w:t xml:space="preserve">Minor</w:t>
+            </w:r>
+          </w:p>
+        </w:tc>
+        <w:tc>
+          <w:tcPr>
+            <w:tcW w:type="dxa" w:w="4241"/>
+            <w:tcMar>
+              <w:top w:type="dxa" w:w="60"/>
+              <w:left w:type="dxa" w:w="100"/>
+              <w:bottom w:type="dxa" w:w="60"/>
+              <w:right w:type="dxa" w:w="100"/>
+            </w:tcMar>
+          </w:tcPr>
+          <w:p>
+            <w:pPr>
+              <w:spacing w:after="0"/>
+            </w:pPr>
+            <w:r>
+              <w:rPr>
+                <w:sz w:val="19"/>
+                <w:szCs w:val="19"/>
+              </w:rPr>
+              <w:t xml:space="preserve">HUD and HUD buttons showed through dialogs.</w:t>
+            </w:r>
+          </w:p>
+        </w:tc>
+        <w:tc>
+          <w:tcPr>
+            <w:tcW w:type="dxa" w:w="4240"/>
+            <w:tcMar>
+              <w:top w:type="dxa" w:w="60"/>
+              <w:left w:type="dxa" w:w="100"/>
+              <w:bottom w:type="dxa" w:w="60"/>
+              <w:right w:type="dxa" w:w="100"/>
+            </w:tcMar>
+          </w:tcPr>
+          <w:p>
+            <w:pPr>
+              <w:spacing w:after="0"/>
+            </w:pPr>
+            <w:r>
+              <w:rPr>
+                <w:sz w:val="19"/>
+                <w:szCs w:val="19"/>
+              </w:rPr>
+              <w:t xml:space="preserve">HUD and in-game buttons hidden under any dialog; overlays more opaque.</w:t>
+            </w:r>
+          </w:p>
+        </w:tc>
+      </w:tr>
+      <w:tr>
+        <w:tc>
+          <w:tcPr>
+            <w:tcW w:type="dxa" w:w="1157"/>
+            <w:tcMar>
+              <w:top w:type="dxa" w:w="60"/>
+              <w:left w:type="dxa" w:w="100"/>
+              <w:bottom w:type="dxa" w:w="60"/>
+              <w:right w:type="dxa" w:w="100"/>
+            </w:tcMar>
+          </w:tcPr>
+          <w:p>
+            <w:pPr>
+              <w:spacing w:after="0"/>
+            </w:pPr>
+            <w:r>
+              <w:rPr>
+                <w:sz w:val="19"/>
+                <w:szCs w:val="19"/>
+              </w:rPr>
+              <w:t xml:space="preserve">Minor</w:t>
+            </w:r>
+          </w:p>
+        </w:tc>
+        <w:tc>
+          <w:tcPr>
+            <w:tcW w:type="dxa" w:w="4241"/>
+            <w:tcMar>
+              <w:top w:type="dxa" w:w="60"/>
+              <w:left w:type="dxa" w:w="100"/>
+              <w:bottom w:type="dxa" w:w="60"/>
+              <w:right w:type="dxa" w:w="100"/>
+            </w:tcMar>
+          </w:tcPr>
+          <w:p>
+            <w:pPr>
+              <w:spacing w:after="0"/>
+            </w:pPr>
+            <w:r>
+              <w:rPr>
+                <w:sz w:val="19"/>
+                <w:szCs w:val="19"/>
+              </w:rPr>
+              <w:t xml:space="preserve">Endless end screen could say 'Best wave 0'.</w:t>
+            </w:r>
+          </w:p>
+        </w:tc>
+        <w:tc>
+          <w:tcPr>
+            <w:tcW w:type="dxa" w:w="4240"/>
+            <w:tcMar>
+              <w:top w:type="dxa" w:w="60"/>
+              <w:left w:type="dxa" w:w="100"/>
+              <w:bottom w:type="dxa" w:w="60"/>
+              <w:right w:type="dxa" w:w="100"/>
+            </w:tcMar>
+          </w:tcPr>
+          <w:p>
+            <w:pPr>
+              <w:spacing w:after="0"/>
+            </w:pPr>
+            <w:r>
+              <w:rPr>
+                <w:sz w:val="19"/>
+                <w:szCs w:val="19"/>
+              </w:rPr>
+              <w:t xml:space="preserve">Best wave shown only when meaningful.</w:t>
+            </w:r>
+          </w:p>
+        </w:tc>
+      </w:tr>
+      <w:tr>
+        <w:tc>
+          <w:tcPr>
+            <w:tcW w:type="dxa" w:w="1157"/>
+            <w:tcMar>
+              <w:top w:type="dxa" w:w="60"/>
+              <w:left w:type="dxa" w:w="100"/>
+              <w:bottom w:type="dxa" w:w="60"/>
+              <w:right w:type="dxa" w:w="100"/>
+            </w:tcMar>
+          </w:tcPr>
+          <w:p>
+            <w:pPr>
+              <w:spacing w:after="0"/>
+            </w:pPr>
+            <w:r>
+              <w:rPr>
+                <w:sz w:val="19"/>
+                <w:szCs w:val="19"/>
+              </w:rPr>
+              <w:t xml:space="preserve">Minor</w:t>
+            </w:r>
+          </w:p>
+        </w:tc>
+        <w:tc>
+          <w:tcPr>
+            <w:tcW w:type="dxa" w:w="4241"/>
+            <w:tcMar>
+              <w:top w:type="dxa" w:w="60"/>
+              <w:left w:type="dxa" w:w="100"/>
+              <w:bottom w:type="dxa" w:w="60"/>
+              <w:right w:type="dxa" w:w="100"/>
+            </w:tcMar>
+          </w:tcPr>
+          <w:p>
+            <w:pPr>
+              <w:spacing w:after="0"/>
+            </w:pPr>
+            <w:r>
+              <w:rPr>
+                <w:sz w:val="19"/>
+                <w:szCs w:val="19"/>
+              </w:rPr>
+              <w:t xml:space="preserve">Wave 1 punished players who hadn't started moving.</w:t>
+            </w:r>
+          </w:p>
+        </w:tc>
+        <w:tc>
+          <w:tcPr>
+            <w:tcW w:type="dxa" w:w="4240"/>
+            <w:tcMar>
+              <w:top w:type="dxa" w:w="60"/>
+              <w:left w:type="dxa" w:w="100"/>
+              <w:bottom w:type="dxa" w:w="60"/>
+              <w:right w:type="dxa" w:w="100"/>
+            </w:tcMar>
+          </w:tcPr>
+          <w:p>
+            <w:pPr>
+              <w:spacing w:after="0"/>
+            </w:pPr>
+            <w:r>
+              <w:rPr>
+                <w:sz w:val="19"/>
+                <w:szCs w:val="19"/>
+              </w:rPr>
+              <w:t xml:space="preserve">Until anyone moves, wave-1 enemies move at half speed; wave 1 also tightened (less idle time).</w:t>
+            </w:r>
+          </w:p>
+        </w:tc>
+      </w:tr>
+      <w:tr>
+        <w:tc>
+          <w:tcPr>
+            <w:tcW w:type="dxa" w:w="1157"/>
+            <w:tcMar>
+              <w:top w:type="dxa" w:w="60"/>
+              <w:left w:type="dxa" w:w="100"/>
+              <w:bottom w:type="dxa" w:w="60"/>
+              <w:right w:type="dxa" w:w="100"/>
+            </w:tcMar>
+          </w:tcPr>
+          <w:p>
+            <w:pPr>
+              <w:spacing w:after="0"/>
+            </w:pPr>
+            <w:r>
+              <w:rPr>
+                <w:sz w:val="19"/>
+                <w:szCs w:val="19"/>
+              </w:rPr>
+              <w:t xml:space="preserve">Minor</w:t>
+            </w:r>
+          </w:p>
+        </w:tc>
+        <w:tc>
+          <w:tcPr>
+            <w:tcW w:type="dxa" w:w="4241"/>
+            <w:tcMar>
+              <w:top w:type="dxa" w:w="60"/>
+              <w:left w:type="dxa" w:w="100"/>
+              <w:bottom w:type="dxa" w:w="60"/>
+              <w:right w:type="dxa" w:w="100"/>
+            </w:tcMar>
+          </w:tcPr>
+          <w:p>
+            <w:pPr>
+              <w:spacing w:after="0"/>
+            </w:pPr>
+            <w:r>
+              <w:rPr>
+                <w:sz w:val="19"/>
+                <w:szCs w:val="19"/>
+              </w:rPr>
+              <w:t xml:space="preserve">Drop screens: 'Keep waiting' shown during the countdown, stale pause text, a lingering '0'.</w:t>
+            </w:r>
+          </w:p>
+        </w:tc>
+        <w:tc>
+          <w:tcPr>
+            <w:tcW w:type="dxa" w:w="4240"/>
+            <w:tcMar>
+              <w:top w:type="dxa" w:w="60"/>
+              <w:left w:type="dxa" w:w="100"/>
+              <w:bottom w:type="dxa" w:w="60"/>
+              <w:right w:type="dxa" w:w="100"/>
+            </w:tcMar>
+          </w:tcPr>
+          <w:p>
+            <w:pPr>
+              <w:spacing w:after="0"/>
+            </w:pPr>
+            <w:r>
+              <w:rPr>
+                <w:sz w:val="19"/>
+                <w:szCs w:val="19"/>
+              </w:rPr>
+              <w:t xml:space="preserve">Only 'Main menu' during the countdown; after it, 'Keep waiting' appears and the 0 becomes a sentence. A guest closing the tab drops immediately (goodbye message).</w:t>
+            </w:r>
+          </w:p>
+        </w:tc>
+      </w:tr>
+      <w:tr>
+        <w:tc>
+          <w:tcPr>
+            <w:tcW w:type="dxa" w:w="1157"/>
+            <w:tcMar>
+              <w:top w:type="dxa" w:w="60"/>
+              <w:left w:type="dxa" w:w="100"/>
+              <w:bottom w:type="dxa" w:w="60"/>
+              <w:right w:type="dxa" w:w="100"/>
+            </w:tcMar>
+          </w:tcPr>
+          <w:p>
+            <w:pPr>
+              <w:spacing w:after="0"/>
+            </w:pPr>
+            <w:r>
+              <w:rPr>
+                <w:sz w:val="19"/>
+                <w:szCs w:val="19"/>
+              </w:rPr>
+              <w:t xml:space="preserve">Minor</w:t>
+            </w:r>
+          </w:p>
+        </w:tc>
+        <w:tc>
+          <w:tcPr>
+            <w:tcW w:type="dxa" w:w="4241"/>
+            <w:tcMar>
+              <w:top w:type="dxa" w:w="60"/>
+              <w:left w:type="dxa" w:w="100"/>
+              <w:bottom w:type="dxa" w:w="60"/>
+              <w:right w:type="dxa" w:w="100"/>
+            </w:tcMar>
+          </w:tcPr>
+          <w:p>
+            <w:pPr>
+              <w:spacing w:after="0"/>
+            </w:pPr>
+            <w:r>
+              <w:rPr>
+                <w:sz w:val="19"/>
+                <w:szCs w:val="19"/>
+              </w:rPr>
+              <w:t xml:space="preserve">'How to play' dropped players straight into a Survival run.</w:t>
+            </w:r>
+          </w:p>
+        </w:tc>
+        <w:tc>
+          <w:tcPr>
+            <w:tcW w:type="dxa" w:w="4240"/>
+            <w:tcMar>
+              <w:top w:type="dxa" w:w="60"/>
+              <w:left w:type="dxa" w:w="100"/>
+              <w:bottom w:type="dxa" w:w="60"/>
+              <w:right w:type="dxa" w:w="100"/>
+            </w:tcMar>
+          </w:tcPr>
+          <w:p>
+            <w:pPr>
+              <w:spacing w:after="0"/>
+            </w:pPr>
+            <w:r>
+              <w:rPr>
+                <w:sz w:val="19"/>
+                <w:szCs w:val="19"/>
+              </w:rPr>
+              <w:t xml:space="preserve">It now ends on a 'You've got it!' screen: Play Survival / Main menu.</w:t>
+            </w:r>
+          </w:p>
+        </w:tc>
+      </w:tr>
+      <w:tr>
+        <w:tc>
+          <w:tcPr>
+            <w:tcW w:type="dxa" w:w="1157"/>
+            <w:tcMar>
+              <w:top w:type="dxa" w:w="60"/>
+              <w:left w:type="dxa" w:w="100"/>
+              <w:bottom w:type="dxa" w:w="60"/>
+              <w:right w:type="dxa" w:w="100"/>
+            </w:tcMar>
+          </w:tcPr>
+          <w:p>
+            <w:pPr>
+              <w:spacing w:after="0"/>
+            </w:pPr>
+            <w:r>
+              <w:rPr>
+                <w:sz w:val="19"/>
+                <w:szCs w:val="19"/>
+              </w:rPr>
+              <w:t xml:space="preserve">Minor</w:t>
+            </w:r>
+          </w:p>
+        </w:tc>
+        <w:tc>
+          <w:tcPr>
+            <w:tcW w:type="dxa" w:w="4241"/>
+            <w:tcMar>
+              <w:top w:type="dxa" w:w="60"/>
+              <w:left w:type="dxa" w:w="100"/>
+              <w:bottom w:type="dxa" w:w="60"/>
+              <w:right w:type="dxa" w:w="100"/>
+            </w:tcMar>
+          </w:tcPr>
+          <w:p>
+            <w:pPr>
+              <w:spacing w:after="0"/>
+            </w:pPr>
+            <w:r>
+              <w:rPr>
+                <w:sz w:val="19"/>
+                <w:szCs w:val="19"/>
+              </w:rPr>
+              <w:t xml:space="preserve">No keyboard pause.</w:t>
+            </w:r>
+          </w:p>
+        </w:tc>
+        <w:tc>
+          <w:tcPr>
+            <w:tcW w:type="dxa" w:w="4240"/>
+            <w:tcMar>
+              <w:top w:type="dxa" w:w="60"/>
+              <w:left w:type="dxa" w:w="100"/>
+              <w:bottom w:type="dxa" w:w="60"/>
+              <w:right w:type="dxa" w:w="100"/>
+            </w:tcMar>
+          </w:tcPr>
+          <w:p>
+            <w:pPr>
+              <w:spacing w:after="0"/>
+            </w:pPr>
+            <w:r>
+              <w:rPr>
+                <w:sz w:val="19"/>
+                <w:szCs w:val="19"/>
+              </w:rPr>
+              <w:t xml:space="preserve">Esc / P pause and resume.</w:t>
+            </w:r>
+          </w:p>
+        </w:tc>
+      </w:tr>
+      <w:tr>
+        <w:tc>
+          <w:tcPr>
+            <w:tcW w:type="dxa" w:w="1157"/>
+            <w:tcMar>
+              <w:top w:type="dxa" w:w="60"/>
+              <w:left w:type="dxa" w:w="100"/>
+              <w:bottom w:type="dxa" w:w="60"/>
+              <w:right w:type="dxa" w:w="100"/>
+            </w:tcMar>
+          </w:tcPr>
+          <w:p>
+            <w:pPr>
+              <w:spacing w:after="0"/>
+            </w:pPr>
+            <w:r>
+              <w:rPr>
+                <w:sz w:val="19"/>
+                <w:szCs w:val="19"/>
+              </w:rPr>
+              <w:t xml:space="preserve">Minor</w:t>
+            </w:r>
+          </w:p>
+        </w:tc>
+        <w:tc>
+          <w:tcPr>
+            <w:tcW w:type="dxa" w:w="4241"/>
+            <w:tcMar>
+              <w:top w:type="dxa" w:w="60"/>
+              <w:left w:type="dxa" w:w="100"/>
+              <w:bottom w:type="dxa" w:w="60"/>
+              <w:right w:type="dxa" w:w="100"/>
+            </w:tcMar>
+          </w:tcPr>
+          <w:p>
+            <w:pPr>
+              <w:spacing w:after="0"/>
+            </w:pPr>
+            <w:r>
+              <w:rPr>
+                <w:sz w:val="19"/>
+                <w:szCs w:val="19"/>
+              </w:rPr>
+              <w:t xml:space="preserve">Buttons under 48 px.</w:t>
+            </w:r>
+          </w:p>
+        </w:tc>
+        <w:tc>
+          <w:tcPr>
+            <w:tcW w:type="dxa" w:w="4240"/>
+            <w:tcMar>
+              <w:top w:type="dxa" w:w="60"/>
+              <w:left w:type="dxa" w:w="100"/>
+              <w:bottom w:type="dxa" w:w="60"/>
+              <w:right w:type="dxa" w:w="100"/>
+            </w:tcMar>
+          </w:tcPr>
+          <w:p>
+            <w:pPr>
+              <w:spacing w:after="0"/>
+            </w:pPr>
+            <w:r>
+              <w:rPr>
+                <w:sz w:val="19"/>
+                <w:szCs w:val="19"/>
+              </w:rPr>
+              <w:t xml:space="preserve">In-game buttons 52×48 px, inside safe-area insets.</w:t>
+            </w:r>
+          </w:p>
+        </w:tc>
+      </w:tr>
+      <w:tr>
+        <w:tc>
+          <w:tcPr>
+            <w:tcW w:type="dxa" w:w="1157"/>
+            <w:tcMar>
+              <w:top w:type="dxa" w:w="60"/>
+              <w:left w:type="dxa" w:w="100"/>
+              <w:bottom w:type="dxa" w:w="60"/>
+              <w:right w:type="dxa" w:w="100"/>
+            </w:tcMar>
+          </w:tcPr>
+          <w:p>
+            <w:pPr>
+              <w:spacing w:after="0"/>
+            </w:pPr>
+            <w:r>
+              <w:rPr>
+                <w:sz w:val="19"/>
+                <w:szCs w:val="19"/>
+              </w:rPr>
+              <w:t xml:space="preserve">Minor</w:t>
+            </w:r>
+          </w:p>
+        </w:tc>
+        <w:tc>
+          <w:tcPr>
+            <w:tcW w:type="dxa" w:w="4241"/>
+            <w:tcMar>
+              <w:top w:type="dxa" w:w="60"/>
+              <w:left w:type="dxa" w:w="100"/>
+              <w:bottom w:type="dxa" w:w="60"/>
+              <w:right w:type="dxa" w:w="100"/>
+            </w:tcMar>
+          </w:tcPr>
+          <w:p>
+            <w:pPr>
+              <w:spacing w:after="0"/>
+            </w:pPr>
+            <w:r>
+              <w:rPr>
+                <w:sz w:val="19"/>
+                <w:szCs w:val="19"/>
+              </w:rPr>
+              <w:t xml:space="preserve">4:3 tablets letterbox the 2:1 arena; HUD far from the action.</w:t>
+            </w:r>
+          </w:p>
+        </w:tc>
+        <w:tc>
+          <w:tcPr>
+            <w:tcW w:type="dxa" w:w="4240"/>
+            <w:tcMar>
+              <w:top w:type="dxa" w:w="60"/>
+              <w:left w:type="dxa" w:w="100"/>
+              <w:bottom w:type="dxa" w:w="60"/>
+              <w:right w:type="dxa" w:w="100"/>
+            </w:tcMar>
+          </w:tcPr>
+          <w:p>
+            <w:pPr>
+              <w:spacing w:after="0"/>
+            </w:pPr>
+            <w:r>
+              <w:rPr>
+                <w:sz w:val="19"/>
+                <w:szCs w:val="19"/>
+              </w:rPr>
+              <w:t xml:space="preserve">HUD now sits just above the arena on tall screens. The arena stays 2:1 on purpose so both phones in an online game see the same world.</w:t>
+            </w:r>
+          </w:p>
+        </w:tc>
+      </w:tr>
+      <w:tr>
+        <w:tc>
+          <w:tcPr>
+            <w:tcW w:type="dxa" w:w="1157"/>
+            <w:tcMar>
+              <w:top w:type="dxa" w:w="60"/>
+              <w:left w:type="dxa" w:w="100"/>
+              <w:bottom w:type="dxa" w:w="60"/>
+              <w:right w:type="dxa" w:w="100"/>
+            </w:tcMar>
+          </w:tcPr>
+          <w:p>
+            <w:pPr>
+              <w:spacing w:after="0"/>
+            </w:pPr>
+            <w:r>
+              <w:rPr>
+                <w:sz w:val="19"/>
+                <w:szCs w:val="19"/>
+              </w:rPr>
+              <w:t xml:space="preserve">Minor</w:t>
+            </w:r>
+          </w:p>
+        </w:tc>
+        <w:tc>
+          <w:tcPr>
+            <w:tcW w:type="dxa" w:w="4241"/>
+            <w:tcMar>
+              <w:top w:type="dxa" w:w="60"/>
+              <w:left w:type="dxa" w:w="100"/>
+              <w:bottom w:type="dxa" w:w="60"/>
+              <w:right w:type="dxa" w:w="100"/>
+            </w:tcMar>
+          </w:tcPr>
+          <w:p>
+            <w:pPr>
+              <w:spacing w:after="0"/>
+            </w:pPr>
+            <w:r>
+              <w:rPr>
+                <w:sz w:val="19"/>
+                <w:szCs w:val="19"/>
+              </w:rPr>
+              <w:t xml:space="preserve">Guest's view of the host orb occasionally stuttered.</w:t>
+            </w:r>
+          </w:p>
+        </w:tc>
+        <w:tc>
+          <w:tcPr>
+            <w:tcW w:type="dxa" w:w="4240"/>
+            <w:tcMar>
+              <w:top w:type="dxa" w:w="60"/>
+              <w:left w:type="dxa" w:w="100"/>
+              <w:bottom w:type="dxa" w:w="60"/>
+              <w:right w:type="dxa" w:w="100"/>
+            </w:tcMar>
+          </w:tcPr>
+          <w:p>
+            <w:pPr>
+              <w:spacing w:after="0"/>
+            </w:pPr>
+            <w:r>
+              <w:rPr>
+                <w:sz w:val="19"/>
+                <w:szCs w:val="19"/>
+              </w:rPr>
+              <w:t xml:space="preserve">Snapshots 20→25 Hz and interpolation delay 100→120 ms.</w:t>
+            </w:r>
+          </w:p>
+        </w:tc>
+      </w:tr>
+      <w:tr>
+        <w:tc>
+          <w:tcPr>
+            <w:tcW w:type="dxa" w:w="1157"/>
+            <w:tcMar>
+              <w:top w:type="dxa" w:w="60"/>
+              <w:left w:type="dxa" w:w="100"/>
+              <w:bottom w:type="dxa" w:w="60"/>
+              <w:right w:type="dxa" w:w="100"/>
+            </w:tcMar>
+          </w:tcPr>
+          <w:p>
+            <w:pPr>
+              <w:spacing w:after="0"/>
+            </w:pPr>
+            <w:r>
+              <w:rPr>
+                <w:sz w:val="19"/>
+                <w:szCs w:val="19"/>
+              </w:rPr>
+              <w:t xml:space="preserve">Polish</w:t>
+            </w:r>
+          </w:p>
+        </w:tc>
+        <w:tc>
+          <w:tcPr>
+            <w:tcW w:type="dxa" w:w="4241"/>
+            <w:tcMar>
+              <w:top w:type="dxa" w:w="60"/>
+              <w:left w:type="dxa" w:w="100"/>
+              <w:bottom w:type="dxa" w:w="60"/>
+              <w:right w:type="dxa" w:w="100"/>
+            </w:tcMar>
+          </w:tcPr>
+          <w:p>
+            <w:pPr>
+              <w:spacing w:after="0"/>
+            </w:pPr>
+            <w:r>
+              <w:rPr>
+                <w:sz w:val="19"/>
+                <w:szCs w:val="19"/>
+              </w:rPr>
+              <w:t xml:space="preserve">Attract demo distracted behind the title text.</w:t>
+            </w:r>
+          </w:p>
+        </w:tc>
+        <w:tc>
+          <w:tcPr>
+            <w:tcW w:type="dxa" w:w="4240"/>
+            <w:tcMar>
+              <w:top w:type="dxa" w:w="60"/>
+              <w:left w:type="dxa" w:w="100"/>
+              <w:bottom w:type="dxa" w:w="60"/>
+              <w:right w:type="dxa" w:w="100"/>
+            </w:tcMar>
+          </w:tcPr>
+          <w:p>
+            <w:pPr>
+              <w:spacing w:after="0"/>
+            </w:pPr>
+            <w:r>
+              <w:rPr>
+                <w:sz w:val="19"/>
+                <w:szCs w:val="19"/>
+              </w:rPr>
+              <w:t xml:space="preserve">Darker veil over the demo.</w:t>
+            </w:r>
+          </w:p>
+        </w:tc>
+      </w:tr>
+      <w:tr>
+        <w:tc>
+          <w:tcPr>
+            <w:tcW w:type="dxa" w:w="1157"/>
+            <w:tcMar>
+              <w:top w:type="dxa" w:w="60"/>
+              <w:left w:type="dxa" w:w="100"/>
+              <w:bottom w:type="dxa" w:w="60"/>
+              <w:right w:type="dxa" w:w="100"/>
+            </w:tcMar>
+          </w:tcPr>
+          <w:p>
+            <w:pPr>
+              <w:spacing w:after="0"/>
+            </w:pPr>
+            <w:r>
+              <w:rPr>
+                <w:sz w:val="19"/>
+                <w:szCs w:val="19"/>
+              </w:rPr>
+              <w:t xml:space="preserve">Polish</w:t>
+            </w:r>
+          </w:p>
+        </w:tc>
+        <w:tc>
+          <w:tcPr>
+            <w:tcW w:type="dxa" w:w="4241"/>
+            <w:tcMar>
+              <w:top w:type="dxa" w:w="60"/>
+              <w:left w:type="dxa" w:w="100"/>
+              <w:bottom w:type="dxa" w:w="60"/>
+              <w:right w:type="dxa" w:w="100"/>
+            </w:tcMar>
+          </w:tcPr>
+          <w:p>
+            <w:pPr>
+              <w:spacing w:after="0"/>
+            </w:pPr>
+            <w:r>
+              <w:rPr>
+                <w:sz w:val="19"/>
+                <w:szCs w:val="19"/>
+              </w:rPr>
+              <w:t xml:space="preserve">Score had no label; showed '0' during the tutorial.</w:t>
+            </w:r>
+          </w:p>
+        </w:tc>
+        <w:tc>
+          <w:tcPr>
+            <w:tcW w:type="dxa" w:w="4240"/>
+            <w:tcMar>
+              <w:top w:type="dxa" w:w="60"/>
+              <w:left w:type="dxa" w:w="100"/>
+              <w:bottom w:type="dxa" w:w="60"/>
+              <w:right w:type="dxa" w:w="100"/>
+            </w:tcMar>
+          </w:tcPr>
+          <w:p>
+            <w:pPr>
+              <w:spacing w:after="0"/>
+            </w:pPr>
+            <w:r>
+              <w:rPr>
+                <w:sz w:val="19"/>
+                <w:szCs w:val="19"/>
+              </w:rPr>
+              <w:t xml:space="preserve">Small SCORE caption; score hidden during the tutorial.</w:t>
+            </w:r>
+          </w:p>
+        </w:tc>
+      </w:tr>
+      <w:tr>
+        <w:tc>
+          <w:tcPr>
+            <w:tcW w:type="dxa" w:w="1157"/>
+            <w:tcMar>
+              <w:top w:type="dxa" w:w="60"/>
+              <w:left w:type="dxa" w:w="100"/>
+              <w:bottom w:type="dxa" w:w="60"/>
+              <w:right w:type="dxa" w:w="100"/>
+            </w:tcMar>
+          </w:tcPr>
+          <w:p>
+            <w:pPr>
+              <w:spacing w:after="0"/>
+            </w:pPr>
+            <w:r>
+              <w:rPr>
+                <w:sz w:val="19"/>
+                <w:szCs w:val="19"/>
+              </w:rPr>
+              <w:t xml:space="preserve">Polish</w:t>
+            </w:r>
+          </w:p>
+        </w:tc>
+        <w:tc>
+          <w:tcPr>
+            <w:tcW w:type="dxa" w:w="4241"/>
+            <w:tcMar>
+              <w:top w:type="dxa" w:w="60"/>
+              <w:left w:type="dxa" w:w="100"/>
+              <w:bottom w:type="dxa" w:w="60"/>
+              <w:right w:type="dxa" w:w="100"/>
+            </w:tcMar>
+          </w:tcPr>
+          <w:p>
+            <w:pPr>
+              <w:spacing w:after="0"/>
+            </w:pPr>
+            <w:r>
+              <w:rPr>
+                <w:sz w:val="19"/>
+                <w:szCs w:val="19"/>
+              </w:rPr>
+              <w:t xml:space="preserve">Host link field cut off the code.</w:t>
+            </w:r>
+          </w:p>
+        </w:tc>
+        <w:tc>
+          <w:tcPr>
+            <w:tcW w:type="dxa" w:w="4240"/>
+            <w:tcMar>
+              <w:top w:type="dxa" w:w="60"/>
+              <w:left w:type="dxa" w:w="100"/>
+              <w:bottom w:type="dxa" w:w="60"/>
+              <w:right w:type="dxa" w:w="100"/>
+            </w:tcMar>
+          </w:tcPr>
+          <w:p>
+            <w:pPr>
+              <w:spacing w:after="0"/>
+            </w:pPr>
+            <w:r>
+              <w:rPr>
+                <w:sz w:val="19"/>
+                <w:szCs w:val="19"/>
+              </w:rPr>
+              <w:t xml:space="preserve">Field scrolls to show the end of the link (the code).</w:t>
+            </w:r>
+          </w:p>
+        </w:tc>
+      </w:tr>
+      <w:tr>
+        <w:tc>
+          <w:tcPr>
+            <w:tcW w:type="dxa" w:w="1157"/>
+            <w:tcMar>
+              <w:top w:type="dxa" w:w="60"/>
+              <w:left w:type="dxa" w:w="100"/>
+              <w:bottom w:type="dxa" w:w="60"/>
+              <w:right w:type="dxa" w:w="100"/>
+            </w:tcMar>
+          </w:tcPr>
+          <w:p>
+            <w:pPr>
+              <w:spacing w:after="0"/>
+            </w:pPr>
+            <w:r>
+              <w:rPr>
+                <w:sz w:val="19"/>
+                <w:szCs w:val="19"/>
+              </w:rPr>
+              <w:t xml:space="preserve">Polish</w:t>
+            </w:r>
+          </w:p>
+        </w:tc>
+        <w:tc>
+          <w:tcPr>
+            <w:tcW w:type="dxa" w:w="4241"/>
+            <w:tcMar>
+              <w:top w:type="dxa" w:w="60"/>
+              <w:left w:type="dxa" w:w="100"/>
+              <w:bottom w:type="dxa" w:w="60"/>
+              <w:right w:type="dxa" w:w="100"/>
+            </w:tcMar>
+          </w:tcPr>
+          <w:p>
+            <w:pPr>
+              <w:spacing w:after="0"/>
+            </w:pPr>
+            <w:r>
+              <w:rPr>
+                <w:sz w:val="19"/>
+                <w:szCs w:val="19"/>
+              </w:rPr>
+              <w:t xml:space="preserve">No settings in the pause menu.</w:t>
+            </w:r>
+          </w:p>
+        </w:tc>
+        <w:tc>
+          <w:tcPr>
+            <w:tcW w:type="dxa" w:w="4240"/>
+            <w:tcMar>
+              <w:top w:type="dxa" w:w="60"/>
+              <w:left w:type="dxa" w:w="100"/>
+              <w:bottom w:type="dxa" w:w="60"/>
+              <w:right w:type="dxa" w:w="100"/>
+            </w:tcMar>
+          </w:tcPr>
+          <w:p>
+            <w:pPr>
+              <w:spacing w:after="0"/>
+            </w:pPr>
+            <w:r>
+              <w:rPr>
+                <w:sz w:val="19"/>
+                <w:szCs w:val="19"/>
+              </w:rPr>
+              <w:t xml:space="preserve">Settings button in Pause (shake applies immediately; Assist applies from the next game, labelled).</w:t>
+            </w:r>
+          </w:p>
+        </w:tc>
+      </w:tr>
+      <w:tr>
+        <w:tc>
+          <w:tcPr>
+            <w:tcW w:type="dxa" w:w="1157"/>
+            <w:tcMar>
+              <w:top w:type="dxa" w:w="60"/>
+              <w:left w:type="dxa" w:w="100"/>
+              <w:bottom w:type="dxa" w:w="60"/>
+              <w:right w:type="dxa" w:w="100"/>
+            </w:tcMar>
+          </w:tcPr>
+          <w:p>
+            <w:pPr>
+              <w:spacing w:after="0"/>
+            </w:pPr>
+            <w:r>
+              <w:rPr>
+                <w:sz w:val="19"/>
+                <w:szCs w:val="19"/>
+              </w:rPr>
+              <w:t xml:space="preserve">Polish</w:t>
+            </w:r>
+          </w:p>
+        </w:tc>
+        <w:tc>
+          <w:tcPr>
+            <w:tcW w:type="dxa" w:w="4241"/>
+            <w:tcMar>
+              <w:top w:type="dxa" w:w="60"/>
+              <w:left w:type="dxa" w:w="100"/>
+              <w:bottom w:type="dxa" w:w="60"/>
+              <w:right w:type="dxa" w:w="100"/>
+            </w:tcMar>
+          </w:tcPr>
+          <w:p>
+            <w:pPr>
+              <w:spacing w:after="0"/>
+            </w:pPr>
+            <w:r>
+              <w:rPr>
+                <w:sz w:val="19"/>
+                <w:szCs w:val="19"/>
+              </w:rPr>
+              <w:t xml:space="preserve">Boss can feel short for expert teams (~20–35 s).</w:t>
+            </w:r>
+          </w:p>
+        </w:tc>
+        <w:tc>
+          <w:tcPr>
+            <w:tcW w:type="dxa" w:w="4240"/>
+            <w:tcMar>
+              <w:top w:type="dxa" w:w="60"/>
+              <w:left w:type="dxa" w:w="100"/>
+              <w:bottom w:type="dxa" w:w="60"/>
+              <w:right w:type="dxa" w:w="100"/>
+            </w:tcMar>
+          </w:tcPr>
+          <w:p>
+            <w:pPr>
+              <w:spacing w:after="0"/>
+            </w:pPr>
+            <w:r>
+              <w:rPr>
+                <w:sz w:val="19"/>
+                <w:szCs w:val="19"/>
+              </w:rPr>
+              <w:t xml:space="preserve">Kept by design: average pairs need ~70 s and only clear 35% overall; lengthening it would push average pairs below the 30% target. Noted as a candidate for a future 'Hard' mode.</w:t>
+            </w:r>
+          </w:p>
+        </w:tc>
+      </w:tr>
+    </w:tbl>
+    <w:p>
+      <w:pPr>
+        <w:spacing w:after="80"/>
+      </w:pPr>
+    </w:p>
+    <w:p>
+      <w:pPr>
+        <w:spacing w:after="120" w:line="276"/>
+      </w:pPr>
+      <w:r>
+        <w:t xml:space="preserve">After the fixes the full simulation was rerun (1,200 runs). All targets still hold — see section 11 (those are the post-review numbers).</w:t>
+      </w:r>
+    </w:p>
+    <w:p>
+      <w:pPr>
+        <w:pStyle w:val="Heading1"/>
+        <w:spacing w:after="120" w:before="240"/>
+      </w:pPr>
+      <w:r>
+        <w:t xml:space="preserve">13. Architecture and extension points</w:t>
       </w:r>
     </w:p>
     <w:p>

</xml_diff>